<commit_message>
Update portfolio and resume
</commit_message>
<xml_diff>
--- a/assets/resume/Vatsal_Ladani_Resume.docx
+++ b/assets/resume/Vatsal_Ladani_Resume.docx
@@ -35,7 +35,8 @@
         <w:pBdr>
           <w:bottom w:val="single" w:sz="6" w:space="0" w:color="1F1F1F"/>
         </w:pBdr>
-        <w:spacing w:before="220" w:after="110"/>
+        <w:spacing w:before="140" w:after="70"/>
+        <w:ind w:firstLine="720"/>
         <w:rPr>
           <w:sz w:val="20"/>
           <w:szCs w:val="20"/>
@@ -46,7 +47,7 @@
           <w:sz w:val="20"/>
           <w:szCs w:val="20"/>
         </w:rPr>
-        <w:t xml:space="preserve">Ahmedabad, Gujarat | +91 8320883089 | ladanivatsal8892@gmail.com | </w:t>
+        <w:t>Ahmedabad, Gujarat | +91 8320883089 |</w:t>
       </w:r>
       <w:hyperlink r:id="rId5" w:history="1">
         <w:r>
@@ -55,7 +56,7 @@
             <w:sz w:val="20"/>
             <w:szCs w:val="20"/>
           </w:rPr>
-          <w:t>GitHu</w:t>
+          <w:t xml:space="preserve"> </w:t>
         </w:r>
         <w:r>
           <w:rPr>
@@ -63,7 +64,7 @@
             <w:sz w:val="20"/>
             <w:szCs w:val="20"/>
           </w:rPr>
-          <w:t>b</w:t>
+          <w:t>vatsalladani.it@gmail.com</w:t>
         </w:r>
       </w:hyperlink>
       <w:r>
@@ -71,14 +72,14 @@
           <w:sz w:val="20"/>
           <w:szCs w:val="20"/>
         </w:rPr>
-        <w:t xml:space="preserve"> | Portfolio</w:t>
+        <w:t xml:space="preserve"> </w:t>
       </w:r>
       <w:r>
         <w:rPr>
           <w:sz w:val="20"/>
           <w:szCs w:val="20"/>
         </w:rPr>
-        <w:t xml:space="preserve"> | </w:t>
+        <w:t xml:space="preserve">| </w:t>
       </w:r>
       <w:hyperlink r:id="rId6" w:history="1">
         <w:r>
@@ -87,23 +88,41 @@
             <w:sz w:val="20"/>
             <w:szCs w:val="20"/>
           </w:rPr>
-          <w:t>Lin</w:t>
+          <w:t>GitHub</w:t>
         </w:r>
+      </w:hyperlink>
+      <w:r>
+        <w:rPr>
+          <w:sz w:val="20"/>
+          <w:szCs w:val="20"/>
+        </w:rPr>
+        <w:t xml:space="preserve"> | </w:t>
+      </w:r>
+      <w:hyperlink r:id="rId7" w:history="1">
         <w:r>
           <w:rPr>
             <w:rStyle w:val="Hyperlink"/>
             <w:sz w:val="20"/>
             <w:szCs w:val="20"/>
           </w:rPr>
-          <w:t>k</w:t>
+          <w:t>Portfolio</w:t>
         </w:r>
+      </w:hyperlink>
+      <w:r>
+        <w:rPr>
+          <w:sz w:val="20"/>
+          <w:szCs w:val="20"/>
+        </w:rPr>
+        <w:t xml:space="preserve"> | </w:t>
+      </w:r>
+      <w:hyperlink r:id="rId8" w:history="1">
         <w:r>
           <w:rPr>
             <w:rStyle w:val="Hyperlink"/>
             <w:sz w:val="20"/>
             <w:szCs w:val="20"/>
           </w:rPr>
-          <w:t>edIn</w:t>
+          <w:t>LinkedIn</w:t>
         </w:r>
       </w:hyperlink>
     </w:p>
@@ -112,7 +131,7 @@
         <w:pBdr>
           <w:bottom w:val="single" w:sz="6" w:space="0" w:color="1F1F1F"/>
         </w:pBdr>
-        <w:spacing w:before="220" w:after="110"/>
+        <w:spacing w:before="140" w:after="70"/>
       </w:pPr>
       <w:r>
         <w:rPr>
@@ -130,10 +149,18 @@
         <w:pBdr>
           <w:bottom w:val="single" w:sz="6" w:space="0" w:color="1F1F1F"/>
         </w:pBdr>
-        <w:spacing w:before="220" w:after="110"/>
-      </w:pPr>
-      <w:r>
-        <w:t>M.Sc. Information Technology student preparing for entry-level Software Engineer roles. Collaborated on an academic agriculture management web application, gaining practical experience in web development, databases, and team-based software development. Currently building backend development skills through Python, FastAPI, PostgreSQL, SQL, and project-based learning.</w:t>
+        <w:spacing w:before="140" w:after="70"/>
+      </w:pPr>
+      <w:r>
+        <w:t xml:space="preserve">M.Sc. Information Technology student preparing for entry-level Software Engineer roles. Collaborated on an academic agriculture management web application, gaining practical experience in web development, databases, and team-based software development. Currently strengthening backend development skills through Python, </w:t>
+      </w:r>
+      <w:proofErr w:type="spellStart"/>
+      <w:r>
+        <w:t>FastAPI</w:t>
+      </w:r>
+      <w:proofErr w:type="spellEnd"/>
+      <w:r>
+        <w:t>, PostgreSQL, SQL, and project-based learning.</w:t>
       </w:r>
     </w:p>
     <w:p>
@@ -141,7 +168,7 @@
         <w:pBdr>
           <w:bottom w:val="single" w:sz="6" w:space="0" w:color="1F1F1F"/>
         </w:pBdr>
-        <w:spacing w:before="220" w:after="110"/>
+        <w:spacing w:before="140" w:after="70"/>
       </w:pPr>
       <w:r>
         <w:rPr>
@@ -166,13 +193,7 @@
         <w:t xml:space="preserve">Programming Languages: </w:t>
       </w:r>
       <w:r>
-        <w:t xml:space="preserve">Python, SQL, </w:t>
-      </w:r>
-      <w:r>
-        <w:t xml:space="preserve">JavaScript, </w:t>
-      </w:r>
-      <w:r>
-        <w:t>HTML5, CSS3, PHP (Academic Project)</w:t>
+        <w:t>Python, SQL, JavaScript, HTML5, CSS3, PHP (Academic Project)</w:t>
       </w:r>
     </w:p>
     <w:p>
@@ -186,8 +207,13 @@
         </w:rPr>
         <w:t xml:space="preserve">Backend: </w:t>
       </w:r>
-      <w:r>
-        <w:t>FastAPI, REST APIs</w:t>
+      <w:proofErr w:type="spellStart"/>
+      <w:r>
+        <w:t>FastAPI</w:t>
+      </w:r>
+      <w:proofErr w:type="spellEnd"/>
+      <w:r>
+        <w:t>, REST APIs</w:t>
       </w:r>
     </w:p>
     <w:p>
@@ -240,7 +266,7 @@
         <w:pBdr>
           <w:bottom w:val="single" w:sz="6" w:space="0" w:color="1F1F1F"/>
         </w:pBdr>
-        <w:spacing w:before="220" w:after="110"/>
+        <w:spacing w:before="140" w:after="70"/>
       </w:pPr>
       <w:r>
         <w:rPr>
@@ -255,14 +281,30 @@
     </w:p>
     <w:p>
       <w:pPr>
+        <w:tabs>
+          <w:tab w:val="right" w:pos="10034"/>
+        </w:tabs>
         <w:spacing w:after="20" w:line="300" w:lineRule="auto"/>
       </w:pPr>
-      <w:r>
-        <w:rPr>
-          <w:b/>
-          <w:bCs/>
-        </w:rPr>
-        <w:t>AgroMeds — Agriculture Management Web Application</w:t>
+      <w:proofErr w:type="spellStart"/>
+      <w:r>
+        <w:rPr>
+          <w:b/>
+          <w:bCs/>
+        </w:rPr>
+        <w:t>AgroMeds</w:t>
+      </w:r>
+      <w:proofErr w:type="spellEnd"/>
+      <w:r>
+        <w:rPr>
+          <w:b/>
+          <w:bCs/>
+        </w:rPr>
+        <w:t xml:space="preserve"> — Agriculture Management Web Application</w:t>
+      </w:r>
+      <w:r>
+        <w:tab/>
+        <w:t>2025</w:t>
       </w:r>
     </w:p>
     <w:p>
@@ -278,40 +320,29 @@
           <w:sz w:val="20"/>
           <w:szCs w:val="20"/>
         </w:rPr>
-        <w:t>Tech Stack:</w:t>
-      </w:r>
-      <w:r>
-        <w:rPr>
-          <w:b/>
-          <w:bCs/>
+        <w:t xml:space="preserve">Tech Stack: </w:t>
+      </w:r>
+      <w:r>
+        <w:rPr>
           <w:i/>
           <w:iCs/>
           <w:sz w:val="20"/>
           <w:szCs w:val="20"/>
         </w:rPr>
-        <w:t xml:space="preserve"> </w:t>
-      </w:r>
-      <w:r>
-        <w:rPr>
+        <w:t xml:space="preserve">PHP, MySQL, HTML5, CSS3, Bootstrap, JavaScript   |   </w:t>
+      </w:r>
+      <w:r>
+        <w:rPr>
+          <w:b/>
+          <w:bCs/>
           <w:i/>
           <w:iCs/>
           <w:sz w:val="20"/>
           <w:szCs w:val="20"/>
         </w:rPr>
-        <w:t xml:space="preserve">PHP, MySQL, HTML5, CSS3, Bootstrap, JavaScript   |   </w:t>
-      </w:r>
-      <w:r>
-        <w:rPr>
-          <w:b/>
-          <w:bCs/>
-          <w:i/>
-          <w:iCs/>
-          <w:sz w:val="20"/>
-          <w:szCs w:val="20"/>
-        </w:rPr>
         <w:t xml:space="preserve">GitHub: </w:t>
       </w:r>
-      <w:hyperlink r:id="rId7" w:history="1">
+      <w:hyperlink r:id="rId9" w:history="1">
         <w:r>
           <w:rPr>
             <w:rStyle w:val="Hyperlink"/>
@@ -357,20 +388,24 @@
           <w:ilvl w:val="0"/>
           <w:numId w:val="2"/>
         </w:numPr>
-        <w:spacing w:after="65"/>
-      </w:pPr>
-      <w:r>
-        <w:t>Used MySQL to store application data and connect frontend pages with backend functionality.</w:t>
-      </w:r>
-    </w:p>
-    <w:p>
-      <w:pPr>
         <w:tabs>
           <w:tab w:val="right" w:pos="10034"/>
         </w:tabs>
         <w:spacing w:after="20"/>
       </w:pPr>
       <w:r>
+        <w:t>Used MySQL for application data storage and integrated frontend pages with backend functionality.</w:t>
+      </w:r>
+    </w:p>
+    <w:p>
+      <w:pPr>
+        <w:tabs>
+          <w:tab w:val="right" w:pos="10034"/>
+        </w:tabs>
+        <w:spacing w:after="20"/>
+        <w:ind w:left="100"/>
+      </w:pPr>
+      <w:r>
         <w:rPr>
           <w:b/>
           <w:bCs/>
@@ -379,6 +414,7 @@
       </w:r>
       <w:r>
         <w:tab/>
+        <w:t>2026</w:t>
       </w:r>
     </w:p>
     <w:p>
@@ -392,47 +428,20 @@
           <w:sz w:val="20"/>
           <w:szCs w:val="20"/>
         </w:rPr>
-        <w:t>Tech Stack:</w:t>
-      </w:r>
-      <w:r>
-        <w:rPr>
+        <w:t xml:space="preserve">Tech Stack: HTML5, CSS3, JavaScript    |   </w:t>
+      </w:r>
+      <w:r>
+        <w:rPr>
+          <w:b/>
+          <w:bCs/>
           <w:i/>
           <w:iCs/>
           <w:sz w:val="20"/>
           <w:szCs w:val="20"/>
         </w:rPr>
-        <w:t xml:space="preserve"> HTML5, CSS3, JavaScript</w:t>
-      </w:r>
-      <w:r>
-        <w:rPr>
-          <w:i/>
-          <w:iCs/>
-          <w:sz w:val="20"/>
-          <w:szCs w:val="20"/>
-        </w:rPr>
-        <w:t xml:space="preserve">    </w:t>
-      </w:r>
-      <w:r>
-        <w:rPr>
-          <w:i/>
-          <w:iCs/>
-          <w:sz w:val="20"/>
-          <w:szCs w:val="20"/>
-        </w:rPr>
-        <w:t xml:space="preserve">|   </w:t>
-      </w:r>
-      <w:r>
-        <w:rPr>
-          <w:b/>
-          <w:bCs/>
-          <w:i/>
-          <w:iCs/>
-          <w:sz w:val="20"/>
-          <w:szCs w:val="20"/>
-        </w:rPr>
         <w:t xml:space="preserve">GitHub: </w:t>
       </w:r>
-      <w:hyperlink r:id="rId8" w:history="1">
+      <w:hyperlink r:id="rId10" w:history="1">
         <w:r>
           <w:rPr>
             <w:rStyle w:val="Hyperlink"/>
@@ -441,27 +450,7 @@
             <w:sz w:val="20"/>
             <w:szCs w:val="20"/>
           </w:rPr>
-          <w:t>https://github.com/Vatsalladani/Vatsalladani.g</w:t>
-        </w:r>
-        <w:r>
-          <w:rPr>
-            <w:rStyle w:val="Hyperlink"/>
-            <w:i/>
-            <w:iCs/>
-            <w:sz w:val="20"/>
-            <w:szCs w:val="20"/>
-          </w:rPr>
-          <w:t>i</w:t>
-        </w:r>
-        <w:r>
-          <w:rPr>
-            <w:rStyle w:val="Hyperlink"/>
-            <w:i/>
-            <w:iCs/>
-            <w:sz w:val="20"/>
-            <w:szCs w:val="20"/>
-          </w:rPr>
-          <w:t>thub.io</w:t>
+          <w:t>https://github.com/Vatsalladani/Vatsalladani.github.io</w:t>
         </w:r>
       </w:hyperlink>
     </w:p>
@@ -488,25 +477,7 @@
         <w:spacing w:after="65"/>
       </w:pPr>
       <w:r>
-        <w:t>Built using semantic HTML, modern CSS, and vanilla JavaScript with a focus on responsive design, accessibility, and clean user experience.</w:t>
-      </w:r>
-    </w:p>
-    <w:p>
-      <w:pPr>
-        <w:pBdr>
-          <w:bottom w:val="single" w:sz="6" w:space="0" w:color="1F1F1F"/>
-        </w:pBdr>
-        <w:spacing w:before="220" w:after="110"/>
-      </w:pPr>
-      <w:r>
-        <w:rPr>
-          <w:b/>
-          <w:bCs/>
-          <w:color w:val="1F1F1F"/>
-          <w:sz w:val="24"/>
-          <w:szCs w:val="24"/>
-        </w:rPr>
-        <w:t>EDUCATION</w:t>
+        <w:t>Built using semantic HTML, modern CSS, and vanilla JavaScript, with a focus on responsive design, accessibility, and a clean user experience.</w:t>
       </w:r>
     </w:p>
     <w:p>
@@ -514,79 +485,70 @@
         <w:tabs>
           <w:tab w:val="right" w:pos="10034"/>
         </w:tabs>
-        <w:spacing w:after="10"/>
-      </w:pPr>
-      <w:r>
-        <w:rPr>
-          <w:b/>
-          <w:bCs/>
-        </w:rPr>
-        <w:t>LJ University</w:t>
+        <w:spacing w:after="20" w:line="300" w:lineRule="auto"/>
+      </w:pPr>
+      <w:r>
+        <w:rPr>
+          <w:b/>
+          <w:bCs/>
+        </w:rPr>
+        <w:t>SmartResume.ai — AI-Powered ATS Resume Optimization SaaS</w:t>
+      </w:r>
+      <w:r>
+        <w:rPr>
+          <w:b/>
+          <w:bCs/>
+        </w:rPr>
+        <w:t xml:space="preserve"> (In Progress)</w:t>
       </w:r>
       <w:r>
         <w:tab/>
-        <w:t>2025 – Present</w:t>
-      </w:r>
-    </w:p>
-    <w:p>
-      <w:pPr>
-        <w:spacing w:after="100" w:line="300" w:lineRule="auto"/>
-      </w:pPr>
-      <w:r>
-        <w:t>Master of Science (M.Sc.), Information Technology</w:t>
-      </w:r>
-    </w:p>
-    <w:p>
-      <w:pPr>
-        <w:tabs>
-          <w:tab w:val="right" w:pos="10034"/>
-        </w:tabs>
-        <w:spacing w:after="10"/>
-      </w:pPr>
-      <w:r>
-        <w:rPr>
-          <w:b/>
-          <w:bCs/>
-        </w:rPr>
-        <w:t>Ganpat University</w:t>
-      </w:r>
-      <w:r>
-        <w:tab/>
-        <w:t>2022 – 2025</w:t>
-      </w:r>
-    </w:p>
-    <w:p>
-      <w:pPr>
-        <w:spacing w:after="10" w:line="300" w:lineRule="auto"/>
-      </w:pPr>
-      <w:r>
-        <w:t>Bachelor of Science, Computer Applications &amp; Information Technology</w:t>
-      </w:r>
-    </w:p>
-    <w:p>
-      <w:pPr>
-        <w:spacing w:after="60" w:line="300" w:lineRule="auto"/>
-      </w:pPr>
-      <w:r>
-        <w:t>CGPA: 7.68 / 10</w:t>
-      </w:r>
-    </w:p>
-    <w:p>
-      <w:pPr>
-        <w:pBdr>
-          <w:bottom w:val="single" w:sz="6" w:space="0" w:color="1F1F1F"/>
-        </w:pBdr>
-        <w:spacing w:before="220" w:after="110"/>
-      </w:pPr>
-      <w:r>
-        <w:rPr>
-          <w:b/>
-          <w:bCs/>
-          <w:color w:val="1F1F1F"/>
-          <w:sz w:val="24"/>
-          <w:szCs w:val="24"/>
-        </w:rPr>
-        <w:t>CERTIFICATIONS</w:t>
+        <w:t>2026 – Present</w:t>
+      </w:r>
+    </w:p>
+    <w:p>
+      <w:pPr>
+        <w:spacing w:after="40"/>
+      </w:pPr>
+      <w:r>
+        <w:rPr>
+          <w:b/>
+          <w:bCs/>
+          <w:i/>
+          <w:iCs/>
+          <w:sz w:val="20"/>
+          <w:szCs w:val="20"/>
+        </w:rPr>
+        <w:t xml:space="preserve">Tech Stack: </w:t>
+      </w:r>
+      <w:r>
+        <w:rPr>
+          <w:i/>
+          <w:iCs/>
+          <w:sz w:val="20"/>
+          <w:szCs w:val="20"/>
+        </w:rPr>
+        <w:t xml:space="preserve">Python, </w:t>
+      </w:r>
+      <w:proofErr w:type="spellStart"/>
+      <w:r>
+        <w:rPr>
+          <w:i/>
+          <w:iCs/>
+          <w:sz w:val="20"/>
+          <w:szCs w:val="20"/>
+        </w:rPr>
+        <w:t>FastAPI</w:t>
+      </w:r>
+      <w:proofErr w:type="spellEnd"/>
+      <w:r>
+        <w:rPr>
+          <w:i/>
+          <w:iCs/>
+          <w:sz w:val="20"/>
+          <w:szCs w:val="20"/>
+        </w:rPr>
+        <w:t>, PostgreSQL, HTML5, CSS3, JavaScript</w:t>
       </w:r>
     </w:p>
     <w:p>
@@ -599,7 +561,23 @@
         <w:spacing w:after="65"/>
       </w:pPr>
       <w:r>
-        <w:t>Python for Everybody — University of Michigan</w:t>
+        <w:t xml:space="preserve">Developing an AI-powered resume optimization platform using Python and </w:t>
+      </w:r>
+      <w:proofErr w:type="spellStart"/>
+      <w:r>
+        <w:t>FastAPI</w:t>
+      </w:r>
+      <w:proofErr w:type="spellEnd"/>
+      <w:r>
+        <w:t xml:space="preserve"> to </w:t>
+      </w:r>
+      <w:proofErr w:type="spellStart"/>
+      <w:r>
+        <w:t>analyze</w:t>
+      </w:r>
+      <w:proofErr w:type="spellEnd"/>
+      <w:r>
+        <w:t xml:space="preserve"> resumes against job descriptions and generate improved, action-oriented content.</w:t>
       </w:r>
     </w:p>
     <w:p>
@@ -612,7 +590,111 @@
         <w:spacing w:after="65"/>
       </w:pPr>
       <w:r>
-        <w:t>Introduction to Software Engineering — IBM</w:t>
+        <w:t>Building</w:t>
+      </w:r>
+      <w:r>
+        <w:t xml:space="preserve"> </w:t>
+      </w:r>
+      <w:r>
+        <w:t>the application with PostgreSQL, HTML5, CSS3, and JavaScript, with a focus on backend development and responsive user interfaces.</w:t>
+      </w:r>
+    </w:p>
+    <w:p>
+      <w:pPr>
+        <w:pBdr>
+          <w:bottom w:val="single" w:sz="6" w:space="0" w:color="1F1F1F"/>
+        </w:pBdr>
+        <w:spacing w:before="140" w:after="70"/>
+      </w:pPr>
+      <w:r>
+        <w:rPr>
+          <w:b/>
+          <w:bCs/>
+          <w:color w:val="1F1F1F"/>
+          <w:sz w:val="24"/>
+          <w:szCs w:val="24"/>
+        </w:rPr>
+        <w:t>EDUCATION</w:t>
+      </w:r>
+    </w:p>
+    <w:p>
+      <w:pPr>
+        <w:tabs>
+          <w:tab w:val="right" w:pos="10034"/>
+        </w:tabs>
+        <w:spacing w:after="10"/>
+      </w:pPr>
+      <w:r>
+        <w:rPr>
+          <w:b/>
+          <w:bCs/>
+        </w:rPr>
+        <w:t>LJ University</w:t>
+      </w:r>
+      <w:r>
+        <w:tab/>
+        <w:t>2025 – Present</w:t>
+      </w:r>
+    </w:p>
+    <w:p>
+      <w:pPr>
+        <w:spacing w:after="100" w:line="300" w:lineRule="auto"/>
+      </w:pPr>
+      <w:r>
+        <w:t>Master of Science (M.Sc.), Information Technology</w:t>
+      </w:r>
+    </w:p>
+    <w:p>
+      <w:pPr>
+        <w:tabs>
+          <w:tab w:val="right" w:pos="10034"/>
+        </w:tabs>
+        <w:spacing w:after="10"/>
+      </w:pPr>
+      <w:r>
+        <w:rPr>
+          <w:b/>
+          <w:bCs/>
+        </w:rPr>
+        <w:t>Ganpat University</w:t>
+      </w:r>
+      <w:r>
+        <w:tab/>
+        <w:t>2022 – 2025</w:t>
+      </w:r>
+    </w:p>
+    <w:p>
+      <w:pPr>
+        <w:spacing w:after="10" w:line="300" w:lineRule="auto"/>
+      </w:pPr>
+      <w:r>
+        <w:t>Bachelor of Science, Computer Applications &amp; Information Technology</w:t>
+      </w:r>
+    </w:p>
+    <w:p>
+      <w:pPr>
+        <w:spacing w:after="60" w:line="300" w:lineRule="auto"/>
+      </w:pPr>
+      <w:r>
+        <w:t>CGPA: 7.68 / 10</w:t>
+      </w:r>
+    </w:p>
+    <w:p>
+      <w:pPr>
+        <w:pBdr>
+          <w:bottom w:val="single" w:sz="6" w:space="0" w:color="1F1F1F"/>
+        </w:pBdr>
+        <w:spacing w:before="140" w:after="70"/>
+      </w:pPr>
+      <w:r>
+        <w:rPr>
+          <w:b/>
+          <w:bCs/>
+          <w:color w:val="1F1F1F"/>
+          <w:sz w:val="24"/>
+          <w:szCs w:val="24"/>
+        </w:rPr>
+        <w:t>CERTIFICATIONS</w:t>
       </w:r>
     </w:p>
     <w:p>
@@ -625,7 +707,7 @@
         <w:spacing w:after="65"/>
       </w:pPr>
       <w:r>
-        <w:t>HTML, CSS, and JavaScript for Developers — Johns Hopkins University</w:t>
+        <w:t>Python for Everybody — University of Michigan</w:t>
       </w:r>
     </w:p>
     <w:p>
@@ -638,12 +720,43 @@
         <w:spacing w:after="65"/>
       </w:pPr>
       <w:r>
-        <w:t>Git and GitHub Complete Master Class — Packt</w:t>
-      </w:r>
+        <w:t>Introduction to Software Engineering — IBM</w:t>
+      </w:r>
+    </w:p>
+    <w:p>
+      <w:pPr>
+        <w:pStyle w:val="ListParagraph"/>
+        <w:numPr>
+          <w:ilvl w:val="0"/>
+          <w:numId w:val="2"/>
+        </w:numPr>
+        <w:spacing w:after="65"/>
+      </w:pPr>
+      <w:r>
+        <w:t>HTML, CSS, and JavaScript for Developers — Johns Hopkins University</w:t>
+      </w:r>
+    </w:p>
+    <w:p>
+      <w:pPr>
+        <w:pStyle w:val="ListParagraph"/>
+        <w:numPr>
+          <w:ilvl w:val="0"/>
+          <w:numId w:val="2"/>
+        </w:numPr>
+        <w:spacing w:after="65"/>
+      </w:pPr>
+      <w:r>
+        <w:t xml:space="preserve">Git and GitHub Complete Master Class — </w:t>
+      </w:r>
+      <w:proofErr w:type="spellStart"/>
+      <w:r>
+        <w:t>Packt</w:t>
+      </w:r>
+      <w:proofErr w:type="spellEnd"/>
     </w:p>
     <w:sectPr>
       <w:pgSz w:w="11906" w:h="16838"/>
-      <w:pgMar w:top="863" w:right="936" w:bottom="863" w:left="936" w:header="708" w:footer="708" w:gutter="0"/>
+      <w:pgMar w:top="620" w:right="936" w:bottom="620" w:left="936" w:header="708" w:footer="708" w:gutter="0"/>
       <w:cols w:space="720"/>
       <w:docGrid w:linePitch="360"/>
     </w:sectPr>
@@ -1290,6 +1403,7 @@
   <w:style w:type="character" w:default="1" w:styleId="DefaultParagraphFont">
     <w:name w:val="Default Paragraph Font"/>
     <w:uiPriority w:val="1"/>
+    <w:semiHidden/>
     <w:unhideWhenUsed/>
   </w:style>
   <w:style w:type="table" w:default="1" w:styleId="TableNormal">

</xml_diff>